<commit_message>
Sync: Add/Update tbb-LPSCI folder - 2026-04-29 20:50
</commit_message>
<xml_diff>
--- a/tbb-LPSCI/Manuscript.docx
+++ b/tbb-LPSCI/Manuscript.docx
@@ -1,6 +1,6 @@
 
 <file path=word/document.xml><?xml version="1.0" encoding="utf-8"?>
-<w:document xmlns:wpc="http://schemas.microsoft.com/office/word/2010/wordprocessingCanvas" xmlns:cx="http://schemas.microsoft.com/office/drawing/2014/chartex" xmlns:cx1="http://schemas.microsoft.com/office/drawing/2015/9/8/chartex" xmlns:cx2="http://schemas.microsoft.com/office/drawing/2015/10/21/chartex" xmlns:cx3="http://schemas.microsoft.com/office/drawing/2016/5/9/chartex" xmlns:cx4="http://schemas.microsoft.com/office/drawing/2016/5/10/chartex" xmlns:cx5="http://schemas.microsoft.com/office/drawing/2016/5/11/chartex" xmlns:cx6="http://schemas.microsoft.com/office/drawing/2016/5/12/chartex" xmlns:cx7="http://schemas.microsoft.com/office/drawing/2016/5/13/chartex" xmlns:cx8="http://schemas.microsoft.com/office/drawing/2016/5/14/chartex" xmlns:mc="http://schemas.openxmlformats.org/markup-compatibility/2006" xmlns:aink="http://schemas.microsoft.com/office/drawing/2016/ink" xmlns:am3d="http://schemas.microsoft.com/office/drawing/2017/model3d" xmlns:o="urn:schemas-microsoft-com:office:office" xmlns:oel="http://schemas.microsoft.com/office/2019/extlst" xmlns:r="http://schemas.openxmlformats.org/officeDocument/2006/relationships" xmlns:m="http://schemas.openxmlformats.org/officeDocument/2006/math" xmlns:v="urn:schemas-microsoft-com:vml" xmlns:wp14="http://schemas.microsoft.com/office/word/2010/wordprocessingDrawing" xmlns:wp="http://schemas.openxmlformats.org/drawingml/2006/wordprocessingDrawing" xmlns:w10="urn:schemas-microsoft-com:office:word" xmlns:w="http://schemas.openxmlformats.org/wordprocessingml/2006/main" xmlns:w14="http://schemas.microsoft.com/office/word/2010/wordml" xmlns:w15="http://schemas.microsoft.com/office/word/2012/wordml" xmlns:w16cex="http://schemas.microsoft.com/office/word/2018/wordml/cex" xmlns:w16cid="http://schemas.microsoft.com/office/word/2016/wordml/cid" xmlns:w16="http://schemas.microsoft.com/office/word/2018/wordml" xmlns:w16du="http://schemas.microsoft.com/office/word/2023/wordml/word16du" xmlns:w16sdtdh="http://schemas.microsoft.com/office/word/2020/wordml/sdtdatahash" xmlns:w16sdtfl="http://schemas.microsoft.com/office/word/2024/wordml/sdtformatlock" xmlns:w16se="http://schemas.microsoft.com/office/word/2015/wordml/symex" xmlns:wpg="http://schemas.microsoft.com/office/word/2010/wordprocessingGroup" xmlns:wpi="http://schemas.microsoft.com/office/word/2010/wordprocessingInk" xmlns:wne="http://schemas.microsoft.com/office/word/2006/wordml" xmlns:wps="http://schemas.microsoft.com/office/word/2010/wordprocessingShape" mc:Ignorable="w14 w15 w16se w16cid w16 w16cex w16sdtdh w16sdtfl w16du wp14">
+<w:document xmlns:wpc="http://schemas.microsoft.com/office/word/2010/wordprocessingCanvas" xmlns:cx="http://schemas.microsoft.com/office/drawing/2014/chartex" xmlns:cx1="http://schemas.microsoft.com/office/drawing/2015/9/8/chartex" xmlns:cx2="http://schemas.microsoft.com/office/drawing/2015/10/21/chartex" xmlns:cx3="http://schemas.microsoft.com/office/drawing/2016/5/9/chartex" xmlns:cx4="http://schemas.microsoft.com/office/drawing/2016/5/10/chartex" xmlns:cx5="http://schemas.microsoft.com/office/drawing/2016/5/11/chartex" xmlns:cx6="http://schemas.microsoft.com/office/drawing/2016/5/12/chartex" xmlns:cx7="http://schemas.microsoft.com/office/drawing/2016/5/13/chartex" xmlns:cx8="http://schemas.microsoft.com/office/drawing/2016/5/14/chartex" xmlns:mc="http://schemas.openxmlformats.org/markup-compatibility/2006" xmlns:aink="http://schemas.microsoft.com/office/drawing/2016/ink" xmlns:am3d="http://schemas.microsoft.com/office/drawing/2017/model3d" xmlns:o="urn:schemas-microsoft-com:office:office" xmlns:r="http://schemas.openxmlformats.org/officeDocument/2006/relationships" xmlns:m="http://schemas.openxmlformats.org/officeDocument/2006/math" xmlns:v="urn:schemas-microsoft-com:vml" xmlns:wp14="http://schemas.microsoft.com/office/word/2010/wordprocessingDrawing" xmlns:wp="http://schemas.openxmlformats.org/drawingml/2006/wordprocessingDrawing" xmlns:w10="urn:schemas-microsoft-com:office:word" xmlns:w="http://schemas.openxmlformats.org/wordprocessingml/2006/main" xmlns:w14="http://schemas.microsoft.com/office/word/2010/wordml" xmlns:w15="http://schemas.microsoft.com/office/word/2012/wordml" xmlns:w16cex="http://schemas.microsoft.com/office/word/2018/wordml/cex" xmlns:w16cid="http://schemas.microsoft.com/office/word/2016/wordml/cid" xmlns:w16="http://schemas.microsoft.com/office/word/2018/wordml" xmlns:w16sdtdh="http://schemas.microsoft.com/office/word/2020/wordml/sdtdatahash" xmlns:w16se="http://schemas.microsoft.com/office/word/2015/wordml/symex" xmlns:wpg="http://schemas.microsoft.com/office/word/2010/wordprocessingGroup" xmlns:wpi="http://schemas.microsoft.com/office/word/2010/wordprocessingInk" xmlns:wne="http://schemas.microsoft.com/office/word/2006/wordml" xmlns:wps="http://schemas.microsoft.com/office/word/2010/wordprocessingShape" mc:Ignorable="w14 w15 w16se w16cid w16 w16cex w16sdtdh wp14">
   <w:body>
     <w:p>
       <w:pPr>
@@ -9761,7 +9761,6 @@
       <w:pPr>
         <w:ind w:firstLineChars="100" w:firstLine="240"/>
         <w:rPr>
-          <w:rFonts w:hint="eastAsia"/>
           <w:noProof/>
           <w14:ligatures w14:val="standardContextual"/>
         </w:rPr>
@@ -11297,12 +11296,22 @@
           <w:color w:val="000000"/>
           <w:szCs w:val="24"/>
         </w:rPr>
-        <w:t xml:space="preserve">. Conductivities of </w:t>
-      </w:r>
-      <w:r>
-        <w:rPr>
-          <w:rFonts w:ascii="Times New Roman" w:eastAsiaTheme="minorHAnsi" w:hAnsi="Times New Roman" w:cs="Times New Roman"/>
-          <w:szCs w:val="24"/>
+        <w:t xml:space="preserve">. </w:t>
+      </w:r>
+      <w:r>
+        <w:rPr>
+          <w:rFonts w:ascii="Times New Roman" w:eastAsiaTheme="minorHAnsi" w:hAnsi="Times New Roman" w:cs="Times New Roman"/>
+          <w:color w:val="000000"/>
+          <w:szCs w:val="24"/>
+          <w:highlight w:val="yellow"/>
+        </w:rPr>
+        <w:t xml:space="preserve">Conductivities of </w:t>
+      </w:r>
+      <w:r>
+        <w:rPr>
+          <w:rFonts w:ascii="Times New Roman" w:eastAsiaTheme="minorHAnsi" w:hAnsi="Times New Roman" w:cs="Times New Roman"/>
+          <w:szCs w:val="24"/>
+          <w:highlight w:val="yellow"/>
         </w:rPr>
         <w:t>Li</w:t>
       </w:r>
@@ -11310,6 +11319,7 @@
         <w:rPr>
           <w:rFonts w:ascii="Times New Roman" w:eastAsiaTheme="minorHAnsi" w:hAnsi="Times New Roman" w:cs="Times New Roman"/>
           <w:szCs w:val="24"/>
+          <w:highlight w:val="yellow"/>
           <w:vertAlign w:val="subscript"/>
         </w:rPr>
         <w:t>6</w:t>
@@ -11318,6 +11328,7 @@
         <w:rPr>
           <w:rFonts w:ascii="Times New Roman" w:eastAsiaTheme="minorHAnsi" w:hAnsi="Times New Roman" w:cs="Times New Roman"/>
           <w:szCs w:val="24"/>
+          <w:highlight w:val="yellow"/>
         </w:rPr>
         <w:t>PS</w:t>
       </w:r>
@@ -11325,6 +11336,7 @@
         <w:rPr>
           <w:rFonts w:ascii="Times New Roman" w:eastAsiaTheme="minorHAnsi" w:hAnsi="Times New Roman" w:cs="Times New Roman"/>
           <w:szCs w:val="24"/>
+          <w:highlight w:val="yellow"/>
           <w:vertAlign w:val="subscript"/>
         </w:rPr>
         <w:t>5</w:t>
@@ -11333,6 +11345,7 @@
         <w:rPr>
           <w:rFonts w:ascii="Times New Roman" w:eastAsiaTheme="minorHAnsi" w:hAnsi="Times New Roman" w:cs="Times New Roman"/>
           <w:szCs w:val="24"/>
+          <w:highlight w:val="yellow"/>
         </w:rPr>
         <w:t>Cl</w:t>
       </w:r>
@@ -11340,6 +11353,7 @@
         <w:rPr>
           <w:rFonts w:ascii="Times New Roman" w:eastAsiaTheme="minorHAnsi" w:hAnsi="Times New Roman" w:cs="Times New Roman"/>
           <w:szCs w:val="24"/>
+          <w:highlight w:val="yellow"/>
           <w:vertAlign w:val="subscript"/>
         </w:rPr>
         <w:t>1-x</w:t>
@@ -11348,6 +11362,7 @@
         <w:rPr>
           <w:rFonts w:ascii="Times New Roman" w:eastAsiaTheme="minorHAnsi" w:hAnsi="Times New Roman" w:cs="Times New Roman"/>
           <w:szCs w:val="24"/>
+          <w:highlight w:val="yellow"/>
         </w:rPr>
         <w:t>I</w:t>
       </w:r>
@@ -11355,6 +11370,7 @@
         <w:rPr>
           <w:rFonts w:ascii="Times New Roman" w:eastAsiaTheme="minorHAnsi" w:hAnsi="Times New Roman" w:cs="Times New Roman"/>
           <w:szCs w:val="24"/>
+          <w:highlight w:val="yellow"/>
           <w:vertAlign w:val="subscript"/>
         </w:rPr>
         <w:t>x</w:t>
@@ -11364,6 +11380,7 @@
           <w:rFonts w:ascii="Times New Roman" w:eastAsiaTheme="minorHAnsi" w:hAnsi="Times New Roman" w:cs="Times New Roman"/>
           <w:color w:val="000000"/>
           <w:szCs w:val="24"/>
+          <w:highlight w:val="yellow"/>
         </w:rPr>
         <w:t xml:space="preserve"> </w:t>
       </w:r>
@@ -11372,6 +11389,7 @@
           <w:rFonts w:ascii="Times New Roman" w:eastAsiaTheme="minorHAnsi" w:hAnsi="Times New Roman" w:cs="Times New Roman"/>
           <w:color w:val="000000"/>
           <w:szCs w:val="24"/>
+          <w:highlight w:val="yellow"/>
         </w:rPr>
         <w:t xml:space="preserve">electrolytes with </w:t>
       </w:r>
@@ -11379,6 +11397,7 @@
         <w:rPr>
           <w:rFonts w:ascii="Times New Roman" w:eastAsiaTheme="minorHAnsi" w:hAnsi="Times New Roman" w:cs="Times New Roman" w:hint="eastAsia"/>
           <w:szCs w:val="24"/>
+          <w:highlight w:val="yellow"/>
         </w:rPr>
         <w:t>x</w:t>
       </w:r>
@@ -11386,6 +11405,7 @@
         <w:rPr>
           <w:rFonts w:ascii="Times New Roman" w:eastAsiaTheme="minorHAnsi" w:hAnsi="Times New Roman" w:cs="Times New Roman"/>
           <w:szCs w:val="24"/>
+          <w:highlight w:val="yellow"/>
         </w:rPr>
         <w:t>=0, 0.1, 0.2, 0.3, 0.4</w:t>
       </w:r>
@@ -11394,6 +11414,7 @@
           <w:rFonts w:ascii="Times New Roman" w:eastAsiaTheme="minorHAnsi" w:hAnsi="Times New Roman" w:cs="Times New Roman"/>
           <w:color w:val="000000"/>
           <w:szCs w:val="24"/>
+          <w:highlight w:val="yellow"/>
         </w:rPr>
         <w:t xml:space="preserve"> are 3.47, 3.51, 2.74, 1.62 and 0.61 mS</w:t>
       </w:r>
@@ -11402,6 +11423,7 @@
           <w:rFonts w:ascii="Times New Roman" w:eastAsiaTheme="minorHAnsi" w:hAnsi="Times New Roman" w:cs="Times New Roman"/>
           <w:color w:val="131413"/>
           <w:szCs w:val="24"/>
+          <w:highlight w:val="yellow"/>
         </w:rPr>
         <w:t>·</w:t>
       </w:r>
@@ -11410,6 +11432,7 @@
           <w:rFonts w:ascii="Times New Roman" w:eastAsiaTheme="minorHAnsi" w:hAnsi="Times New Roman" w:cs="Times New Roman"/>
           <w:color w:val="000000"/>
           <w:szCs w:val="24"/>
+          <w:highlight w:val="yellow"/>
         </w:rPr>
         <w:t>cm</w:t>
       </w:r>
@@ -11418,6 +11441,7 @@
           <w:rFonts w:ascii="Times New Roman" w:eastAsiaTheme="minorHAnsi" w:hAnsi="Times New Roman" w:cs="Times New Roman"/>
           <w:color w:val="000000"/>
           <w:szCs w:val="24"/>
+          <w:highlight w:val="yellow"/>
           <w:vertAlign w:val="superscript"/>
         </w:rPr>
         <w:t>-1</w:t>
@@ -11427,8 +11451,17 @@
           <w:rFonts w:ascii="Times New Roman" w:eastAsiaTheme="minorHAnsi" w:hAnsi="Times New Roman" w:cs="Times New Roman"/>
           <w:color w:val="000000"/>
           <w:szCs w:val="24"/>
-        </w:rPr>
-        <w:t xml:space="preserve">, respectively. The corresponding Nyquist plots are presented in </w:t>
+          <w:highlight w:val="yellow"/>
+        </w:rPr>
+        <w:t>, respectively.</w:t>
+      </w:r>
+      <w:r>
+        <w:rPr>
+          <w:rFonts w:ascii="Times New Roman" w:eastAsiaTheme="minorHAnsi" w:hAnsi="Times New Roman" w:cs="Times New Roman"/>
+          <w:color w:val="000000"/>
+          <w:szCs w:val="24"/>
+        </w:rPr>
+        <w:t xml:space="preserve"> The corresponding Nyquist plots are presented in </w:t>
       </w:r>
       <w:r>
         <w:rPr>
@@ -12139,7 +12172,24 @@
           <w:color w:val="000000"/>
           <w:szCs w:val="24"/>
         </w:rPr>
-        <w:t xml:space="preserve"> electrolytes with x = 0, 0.05, 0.1, 0.2, 0.3,0.4 are 0.3958, 0.3972, 0.3783, 0.3838, 0.4117 and 0.3959 eV, respectively. Figure S5 shows the EIS results of </w:t>
+        <w:t xml:space="preserve"> electrolytes with </w:t>
+      </w:r>
+      <w:r>
+        <w:rPr>
+          <w:rFonts w:ascii="Times New Roman" w:eastAsiaTheme="minorHAnsi" w:hAnsi="Times New Roman" w:cs="Times New Roman"/>
+          <w:color w:val="000000"/>
+          <w:szCs w:val="24"/>
+          <w:highlight w:val="yellow"/>
+        </w:rPr>
+        <w:t>x = 0, 0.05, 0.1, 0.2, 0.3,0.4 are 0.3958, 0.3972, 0.3783, 0.3838, 0.4117 and 0.3959 eV, r</w:t>
+      </w:r>
+      <w:r>
+        <w:rPr>
+          <w:rFonts w:ascii="Times New Roman" w:eastAsiaTheme="minorHAnsi" w:hAnsi="Times New Roman" w:cs="Times New Roman"/>
+          <w:color w:val="000000"/>
+          <w:szCs w:val="24"/>
+        </w:rPr>
+        <w:t xml:space="preserve">espectively. Figure S5 shows the EIS results of </w:t>
       </w:r>
       <w:r>
         <w:rPr>
@@ -14073,7 +14123,25 @@
           <w:color w:val="000000"/>
           <w:szCs w:val="24"/>
         </w:rPr>
-        <w:t>/Gr battery at various C-rates are presented in Fig</w:t>
+        <w:t xml:space="preserve">/Gr battery at various C-rates </w:t>
+      </w:r>
+      <w:proofErr w:type="gramStart"/>
+      <w:r>
+        <w:rPr>
+          <w:rFonts w:ascii="Times New Roman" w:eastAsiaTheme="minorHAnsi" w:hAnsi="Times New Roman" w:cs="Times New Roman"/>
+          <w:color w:val="000000"/>
+          <w:szCs w:val="24"/>
+        </w:rPr>
+        <w:t>are</w:t>
+      </w:r>
+      <w:proofErr w:type="gramEnd"/>
+      <w:r>
+        <w:rPr>
+          <w:rFonts w:ascii="Times New Roman" w:eastAsiaTheme="minorHAnsi" w:hAnsi="Times New Roman" w:cs="Times New Roman"/>
+          <w:color w:val="000000"/>
+          <w:szCs w:val="24"/>
+        </w:rPr>
+        <w:t xml:space="preserve"> presented in Fig</w:t>
       </w:r>
       <w:r>
         <w:rPr>
@@ -15613,14 +15681,11 @@
 </file>
 
 <file path=word/endnotes.xml><?xml version="1.0" encoding="utf-8"?>
-<w:endnotes xmlns:wpc="http://schemas.microsoft.com/office/word/2010/wordprocessingCanvas" xmlns:cx="http://schemas.microsoft.com/office/drawing/2014/chartex" xmlns:cx1="http://schemas.microsoft.com/office/drawing/2015/9/8/chartex" xmlns:cx2="http://schemas.microsoft.com/office/drawing/2015/10/21/chartex" xmlns:cx3="http://schemas.microsoft.com/office/drawing/2016/5/9/chartex" xmlns:cx4="http://schemas.microsoft.com/office/drawing/2016/5/10/chartex" xmlns:cx5="http://schemas.microsoft.com/office/drawing/2016/5/11/chartex" xmlns:cx6="http://schemas.microsoft.com/office/drawing/2016/5/12/chartex" xmlns:cx7="http://schemas.microsoft.com/office/drawing/2016/5/13/chartex" xmlns:cx8="http://schemas.microsoft.com/office/drawing/2016/5/14/chartex" xmlns:mc="http://schemas.openxmlformats.org/markup-compatibility/2006" xmlns:aink="http://schemas.microsoft.com/office/drawing/2016/ink" xmlns:am3d="http://schemas.microsoft.com/office/drawing/2017/model3d" xmlns:o="urn:schemas-microsoft-com:office:office" xmlns:oel="http://schemas.microsoft.com/office/2019/extlst" xmlns:r="http://schemas.openxmlformats.org/officeDocument/2006/relationships" xmlns:m="http://schemas.openxmlformats.org/officeDocument/2006/math" xmlns:v="urn:schemas-microsoft-com:vml" xmlns:wp14="http://schemas.microsoft.com/office/word/2010/wordprocessingDrawing" xmlns:wp="http://schemas.openxmlformats.org/drawingml/2006/wordprocessingDrawing" xmlns:w10="urn:schemas-microsoft-com:office:word" xmlns:w="http://schemas.openxmlformats.org/wordprocessingml/2006/main" xmlns:w14="http://schemas.microsoft.com/office/word/2010/wordml" xmlns:w15="http://schemas.microsoft.com/office/word/2012/wordml" xmlns:w16cex="http://schemas.microsoft.com/office/word/2018/wordml/cex" xmlns:w16cid="http://schemas.microsoft.com/office/word/2016/wordml/cid" xmlns:w16="http://schemas.microsoft.com/office/word/2018/wordml" xmlns:w16du="http://schemas.microsoft.com/office/word/2023/wordml/word16du" xmlns:w16sdtdh="http://schemas.microsoft.com/office/word/2020/wordml/sdtdatahash" xmlns:w16sdtfl="http://schemas.microsoft.com/office/word/2024/wordml/sdtformatlock" xmlns:w16se="http://schemas.microsoft.com/office/word/2015/wordml/symex" xmlns:wpg="http://schemas.microsoft.com/office/word/2010/wordprocessingGroup" xmlns:wpi="http://schemas.microsoft.com/office/word/2010/wordprocessingInk" xmlns:wne="http://schemas.microsoft.com/office/word/2006/wordml" xmlns:wps="http://schemas.microsoft.com/office/word/2010/wordprocessingShape" mc:Ignorable="w14 w15 w16se w16cid w16 w16cex w16sdtdh w16sdtfl w16du wp14">
+<w:endnotes xmlns:wpc="http://schemas.microsoft.com/office/word/2010/wordprocessingCanvas" xmlns:cx="http://schemas.microsoft.com/office/drawing/2014/chartex" xmlns:cx1="http://schemas.microsoft.com/office/drawing/2015/9/8/chartex" xmlns:cx2="http://schemas.microsoft.com/office/drawing/2015/10/21/chartex" xmlns:cx3="http://schemas.microsoft.com/office/drawing/2016/5/9/chartex" xmlns:cx4="http://schemas.microsoft.com/office/drawing/2016/5/10/chartex" xmlns:cx5="http://schemas.microsoft.com/office/drawing/2016/5/11/chartex" xmlns:cx6="http://schemas.microsoft.com/office/drawing/2016/5/12/chartex" xmlns:cx7="http://schemas.microsoft.com/office/drawing/2016/5/13/chartex" xmlns:cx8="http://schemas.microsoft.com/office/drawing/2016/5/14/chartex" xmlns:mc="http://schemas.openxmlformats.org/markup-compatibility/2006" xmlns:aink="http://schemas.microsoft.com/office/drawing/2016/ink" xmlns:am3d="http://schemas.microsoft.com/office/drawing/2017/model3d" xmlns:o="urn:schemas-microsoft-com:office:office" xmlns:r="http://schemas.openxmlformats.org/officeDocument/2006/relationships" xmlns:m="http://schemas.openxmlformats.org/officeDocument/2006/math" xmlns:v="urn:schemas-microsoft-com:vml" xmlns:wp14="http://schemas.microsoft.com/office/word/2010/wordprocessingDrawing" xmlns:wp="http://schemas.openxmlformats.org/drawingml/2006/wordprocessingDrawing" xmlns:w10="urn:schemas-microsoft-com:office:word" xmlns:w="http://schemas.openxmlformats.org/wordprocessingml/2006/main" xmlns:w14="http://schemas.microsoft.com/office/word/2010/wordml" xmlns:w15="http://schemas.microsoft.com/office/word/2012/wordml" xmlns:w16cex="http://schemas.microsoft.com/office/word/2018/wordml/cex" xmlns:w16cid="http://schemas.microsoft.com/office/word/2016/wordml/cid" xmlns:w16="http://schemas.microsoft.com/office/word/2018/wordml" xmlns:w16sdtdh="http://schemas.microsoft.com/office/word/2020/wordml/sdtdatahash" xmlns:w16se="http://schemas.microsoft.com/office/word/2015/wordml/symex" xmlns:wpg="http://schemas.microsoft.com/office/word/2010/wordprocessingGroup" xmlns:wpi="http://schemas.microsoft.com/office/word/2010/wordprocessingInk" xmlns:wne="http://schemas.microsoft.com/office/word/2006/wordml" xmlns:wps="http://schemas.microsoft.com/office/word/2010/wordprocessingShape" mc:Ignorable="w14 w15 w16se w16cid w16 w16cex w16sdtdh wp14">
   <w:endnote w:type="separator" w:id="-1">
     <w:p>
       <w:pPr>
         <w:spacing w:line="240" w:lineRule="auto"/>
-        <w:rPr>
-          <w:rFonts w:hint="eastAsia"/>
-        </w:rPr>
       </w:pPr>
       <w:r>
         <w:separator/>
@@ -15631,9 +15696,6 @@
     <w:p>
       <w:pPr>
         <w:spacing w:line="240" w:lineRule="auto"/>
-        <w:rPr>
-          <w:rFonts w:hint="eastAsia"/>
-        </w:rPr>
       </w:pPr>
       <w:r>
         <w:continuationSeparator/>
@@ -15644,14 +15706,11 @@
 </file>
 
 <file path=word/footnotes.xml><?xml version="1.0" encoding="utf-8"?>
-<w:footnotes xmlns:wpc="http://schemas.microsoft.com/office/word/2010/wordprocessingCanvas" xmlns:cx="http://schemas.microsoft.com/office/drawing/2014/chartex" xmlns:cx1="http://schemas.microsoft.com/office/drawing/2015/9/8/chartex" xmlns:cx2="http://schemas.microsoft.com/office/drawing/2015/10/21/chartex" xmlns:cx3="http://schemas.microsoft.com/office/drawing/2016/5/9/chartex" xmlns:cx4="http://schemas.microsoft.com/office/drawing/2016/5/10/chartex" xmlns:cx5="http://schemas.microsoft.com/office/drawing/2016/5/11/chartex" xmlns:cx6="http://schemas.microsoft.com/office/drawing/2016/5/12/chartex" xmlns:cx7="http://schemas.microsoft.com/office/drawing/2016/5/13/chartex" xmlns:cx8="http://schemas.microsoft.com/office/drawing/2016/5/14/chartex" xmlns:mc="http://schemas.openxmlformats.org/markup-compatibility/2006" xmlns:aink="http://schemas.microsoft.com/office/drawing/2016/ink" xmlns:am3d="http://schemas.microsoft.com/office/drawing/2017/model3d" xmlns:o="urn:schemas-microsoft-com:office:office" xmlns:oel="http://schemas.microsoft.com/office/2019/extlst" xmlns:r="http://schemas.openxmlformats.org/officeDocument/2006/relationships" xmlns:m="http://schemas.openxmlformats.org/officeDocument/2006/math" xmlns:v="urn:schemas-microsoft-com:vml" xmlns:wp14="http://schemas.microsoft.com/office/word/2010/wordprocessingDrawing" xmlns:wp="http://schemas.openxmlformats.org/drawingml/2006/wordprocessingDrawing" xmlns:w10="urn:schemas-microsoft-com:office:word" xmlns:w="http://schemas.openxmlformats.org/wordprocessingml/2006/main" xmlns:w14="http://schemas.microsoft.com/office/word/2010/wordml" xmlns:w15="http://schemas.microsoft.com/office/word/2012/wordml" xmlns:w16cex="http://schemas.microsoft.com/office/word/2018/wordml/cex" xmlns:w16cid="http://schemas.microsoft.com/office/word/2016/wordml/cid" xmlns:w16="http://schemas.microsoft.com/office/word/2018/wordml" xmlns:w16du="http://schemas.microsoft.com/office/word/2023/wordml/word16du" xmlns:w16sdtdh="http://schemas.microsoft.com/office/word/2020/wordml/sdtdatahash" xmlns:w16sdtfl="http://schemas.microsoft.com/office/word/2024/wordml/sdtformatlock" xmlns:w16se="http://schemas.microsoft.com/office/word/2015/wordml/symex" xmlns:wpg="http://schemas.microsoft.com/office/word/2010/wordprocessingGroup" xmlns:wpi="http://schemas.microsoft.com/office/word/2010/wordprocessingInk" xmlns:wne="http://schemas.microsoft.com/office/word/2006/wordml" xmlns:wps="http://schemas.microsoft.com/office/word/2010/wordprocessingShape" mc:Ignorable="w14 w15 w16se w16cid w16 w16cex w16sdtdh w16sdtfl w16du wp14">
+<w:footnotes xmlns:wpc="http://schemas.microsoft.com/office/word/2010/wordprocessingCanvas" xmlns:cx="http://schemas.microsoft.com/office/drawing/2014/chartex" xmlns:cx1="http://schemas.microsoft.com/office/drawing/2015/9/8/chartex" xmlns:cx2="http://schemas.microsoft.com/office/drawing/2015/10/21/chartex" xmlns:cx3="http://schemas.microsoft.com/office/drawing/2016/5/9/chartex" xmlns:cx4="http://schemas.microsoft.com/office/drawing/2016/5/10/chartex" xmlns:cx5="http://schemas.microsoft.com/office/drawing/2016/5/11/chartex" xmlns:cx6="http://schemas.microsoft.com/office/drawing/2016/5/12/chartex" xmlns:cx7="http://schemas.microsoft.com/office/drawing/2016/5/13/chartex" xmlns:cx8="http://schemas.microsoft.com/office/drawing/2016/5/14/chartex" xmlns:mc="http://schemas.openxmlformats.org/markup-compatibility/2006" xmlns:aink="http://schemas.microsoft.com/office/drawing/2016/ink" xmlns:am3d="http://schemas.microsoft.com/office/drawing/2017/model3d" xmlns:o="urn:schemas-microsoft-com:office:office" xmlns:r="http://schemas.openxmlformats.org/officeDocument/2006/relationships" xmlns:m="http://schemas.openxmlformats.org/officeDocument/2006/math" xmlns:v="urn:schemas-microsoft-com:vml" xmlns:wp14="http://schemas.microsoft.com/office/word/2010/wordprocessingDrawing" xmlns:wp="http://schemas.openxmlformats.org/drawingml/2006/wordprocessingDrawing" xmlns:w10="urn:schemas-microsoft-com:office:word" xmlns:w="http://schemas.openxmlformats.org/wordprocessingml/2006/main" xmlns:w14="http://schemas.microsoft.com/office/word/2010/wordml" xmlns:w15="http://schemas.microsoft.com/office/word/2012/wordml" xmlns:w16cex="http://schemas.microsoft.com/office/word/2018/wordml/cex" xmlns:w16cid="http://schemas.microsoft.com/office/word/2016/wordml/cid" xmlns:w16="http://schemas.microsoft.com/office/word/2018/wordml" xmlns:w16sdtdh="http://schemas.microsoft.com/office/word/2020/wordml/sdtdatahash" xmlns:w16se="http://schemas.microsoft.com/office/word/2015/wordml/symex" xmlns:wpg="http://schemas.microsoft.com/office/word/2010/wordprocessingGroup" xmlns:wpi="http://schemas.microsoft.com/office/word/2010/wordprocessingInk" xmlns:wne="http://schemas.microsoft.com/office/word/2006/wordml" xmlns:wps="http://schemas.microsoft.com/office/word/2010/wordprocessingShape" mc:Ignorable="w14 w15 w16se w16cid w16 w16cex w16sdtdh wp14">
   <w:footnote w:type="separator" w:id="-1">
     <w:p>
       <w:pPr>
         <w:spacing w:line="240" w:lineRule="auto"/>
-        <w:rPr>
-          <w:rFonts w:hint="eastAsia"/>
-        </w:rPr>
       </w:pPr>
       <w:r>
         <w:separator/>
@@ -15662,9 +15721,6 @@
     <w:p>
       <w:pPr>
         <w:spacing w:line="240" w:lineRule="auto"/>
-        <w:rPr>
-          <w:rFonts w:hint="eastAsia"/>
-        </w:rPr>
       </w:pPr>
       <w:r>
         <w:continuationSeparator/>
@@ -15675,7 +15731,7 @@
 </file>
 
 <file path=word/numbering.xml><?xml version="1.0" encoding="utf-8"?>
-<w:numbering xmlns:wpc="http://schemas.microsoft.com/office/word/2010/wordprocessingCanvas" xmlns:cx="http://schemas.microsoft.com/office/drawing/2014/chartex" xmlns:cx1="http://schemas.microsoft.com/office/drawing/2015/9/8/chartex" xmlns:cx2="http://schemas.microsoft.com/office/drawing/2015/10/21/chartex" xmlns:cx3="http://schemas.microsoft.com/office/drawing/2016/5/9/chartex" xmlns:cx4="http://schemas.microsoft.com/office/drawing/2016/5/10/chartex" xmlns:cx5="http://schemas.microsoft.com/office/drawing/2016/5/11/chartex" xmlns:cx6="http://schemas.microsoft.com/office/drawing/2016/5/12/chartex" xmlns:cx7="http://schemas.microsoft.com/office/drawing/2016/5/13/chartex" xmlns:cx8="http://schemas.microsoft.com/office/drawing/2016/5/14/chartex" xmlns:mc="http://schemas.openxmlformats.org/markup-compatibility/2006" xmlns:aink="http://schemas.microsoft.com/office/drawing/2016/ink" xmlns:am3d="http://schemas.microsoft.com/office/drawing/2017/model3d" xmlns:o="urn:schemas-microsoft-com:office:office" xmlns:oel="http://schemas.microsoft.com/office/2019/extlst" xmlns:r="http://schemas.openxmlformats.org/officeDocument/2006/relationships" xmlns:m="http://schemas.openxmlformats.org/officeDocument/2006/math" xmlns:v="urn:schemas-microsoft-com:vml" xmlns:wp14="http://schemas.microsoft.com/office/word/2010/wordprocessingDrawing" xmlns:wp="http://schemas.openxmlformats.org/drawingml/2006/wordprocessingDrawing" xmlns:w10="urn:schemas-microsoft-com:office:word" xmlns:w="http://schemas.openxmlformats.org/wordprocessingml/2006/main" xmlns:w14="http://schemas.microsoft.com/office/word/2010/wordml" xmlns:w15="http://schemas.microsoft.com/office/word/2012/wordml" xmlns:w16cex="http://schemas.microsoft.com/office/word/2018/wordml/cex" xmlns:w16cid="http://schemas.microsoft.com/office/word/2016/wordml/cid" xmlns:w16="http://schemas.microsoft.com/office/word/2018/wordml" xmlns:w16du="http://schemas.microsoft.com/office/word/2023/wordml/word16du" xmlns:w16sdtdh="http://schemas.microsoft.com/office/word/2020/wordml/sdtdatahash" xmlns:w16sdtfl="http://schemas.microsoft.com/office/word/2024/wordml/sdtformatlock" xmlns:w16se="http://schemas.microsoft.com/office/word/2015/wordml/symex" xmlns:wpg="http://schemas.microsoft.com/office/word/2010/wordprocessingGroup" xmlns:wpi="http://schemas.microsoft.com/office/word/2010/wordprocessingInk" xmlns:wne="http://schemas.microsoft.com/office/word/2006/wordml" xmlns:wps="http://schemas.microsoft.com/office/word/2010/wordprocessingShape" mc:Ignorable="w14 w15 w16se w16cid w16 w16cex w16sdtdh w16sdtfl w16du wp14">
+<w:numbering xmlns:wpc="http://schemas.microsoft.com/office/word/2010/wordprocessingCanvas" xmlns:cx="http://schemas.microsoft.com/office/drawing/2014/chartex" xmlns:cx1="http://schemas.microsoft.com/office/drawing/2015/9/8/chartex" xmlns:cx2="http://schemas.microsoft.com/office/drawing/2015/10/21/chartex" xmlns:cx3="http://schemas.microsoft.com/office/drawing/2016/5/9/chartex" xmlns:cx4="http://schemas.microsoft.com/office/drawing/2016/5/10/chartex" xmlns:cx5="http://schemas.microsoft.com/office/drawing/2016/5/11/chartex" xmlns:cx6="http://schemas.microsoft.com/office/drawing/2016/5/12/chartex" xmlns:cx7="http://schemas.microsoft.com/office/drawing/2016/5/13/chartex" xmlns:cx8="http://schemas.microsoft.com/office/drawing/2016/5/14/chartex" xmlns:mc="http://schemas.openxmlformats.org/markup-compatibility/2006" xmlns:aink="http://schemas.microsoft.com/office/drawing/2016/ink" xmlns:am3d="http://schemas.microsoft.com/office/drawing/2017/model3d" xmlns:o="urn:schemas-microsoft-com:office:office" xmlns:r="http://schemas.openxmlformats.org/officeDocument/2006/relationships" xmlns:m="http://schemas.openxmlformats.org/officeDocument/2006/math" xmlns:v="urn:schemas-microsoft-com:vml" xmlns:wp14="http://schemas.microsoft.com/office/word/2010/wordprocessingDrawing" xmlns:wp="http://schemas.openxmlformats.org/drawingml/2006/wordprocessingDrawing" xmlns:w10="urn:schemas-microsoft-com:office:word" xmlns:w="http://schemas.openxmlformats.org/wordprocessingml/2006/main" xmlns:w14="http://schemas.microsoft.com/office/word/2010/wordml" xmlns:w15="http://schemas.microsoft.com/office/word/2012/wordml" xmlns:w16cex="http://schemas.microsoft.com/office/word/2018/wordml/cex" xmlns:w16cid="http://schemas.microsoft.com/office/word/2016/wordml/cid" xmlns:w16="http://schemas.microsoft.com/office/word/2018/wordml" xmlns:w16sdtdh="http://schemas.microsoft.com/office/word/2020/wordml/sdtdatahash" xmlns:w16se="http://schemas.microsoft.com/office/word/2015/wordml/symex" xmlns:wpg="http://schemas.microsoft.com/office/word/2010/wordprocessingGroup" xmlns:wpi="http://schemas.microsoft.com/office/word/2010/wordprocessingInk" xmlns:wne="http://schemas.microsoft.com/office/word/2006/wordml" xmlns:wps="http://schemas.microsoft.com/office/word/2010/wordprocessingShape" mc:Ignorable="w14 w15 w16se w16cid w16 w16cex w16sdtdh wp14">
   <w:abstractNum w:abstractNumId="0" w15:restartNumberingAfterBreak="0">
     <w:nsid w:val="01302AD5"/>
     <w:multiLevelType w:val="hybridMultilevel"/>
@@ -16504,38 +16560,38 @@
       </w:pPr>
     </w:lvl>
   </w:abstractNum>
-  <w:num w:numId="1" w16cid:durableId="1240284957">
+  <w:num w:numId="1">
     <w:abstractNumId w:val="7"/>
   </w:num>
-  <w:num w:numId="2" w16cid:durableId="1220046189">
+  <w:num w:numId="2">
     <w:abstractNumId w:val="2"/>
   </w:num>
-  <w:num w:numId="3" w16cid:durableId="1964265575">
+  <w:num w:numId="3">
     <w:abstractNumId w:val="4"/>
   </w:num>
-  <w:num w:numId="4" w16cid:durableId="199558943">
+  <w:num w:numId="4">
     <w:abstractNumId w:val="5"/>
   </w:num>
-  <w:num w:numId="5" w16cid:durableId="2097632351">
+  <w:num w:numId="5">
     <w:abstractNumId w:val="8"/>
   </w:num>
-  <w:num w:numId="6" w16cid:durableId="20447248">
+  <w:num w:numId="6">
     <w:abstractNumId w:val="0"/>
   </w:num>
-  <w:num w:numId="7" w16cid:durableId="1502769703">
+  <w:num w:numId="7">
     <w:abstractNumId w:val="1"/>
   </w:num>
-  <w:num w:numId="8" w16cid:durableId="876116791">
+  <w:num w:numId="8">
     <w:abstractNumId w:val="6"/>
   </w:num>
-  <w:num w:numId="9" w16cid:durableId="696125980">
+  <w:num w:numId="9">
     <w:abstractNumId w:val="3"/>
   </w:num>
 </w:numbering>
 </file>
 
 <file path=word/styles.xml><?xml version="1.0" encoding="utf-8"?>
-<w:styles xmlns:mc="http://schemas.openxmlformats.org/markup-compatibility/2006" xmlns:r="http://schemas.openxmlformats.org/officeDocument/2006/relationships" xmlns:w="http://schemas.openxmlformats.org/wordprocessingml/2006/main" xmlns:w14="http://schemas.microsoft.com/office/word/2010/wordml" xmlns:w15="http://schemas.microsoft.com/office/word/2012/wordml" xmlns:w16cex="http://schemas.microsoft.com/office/word/2018/wordml/cex" xmlns:w16cid="http://schemas.microsoft.com/office/word/2016/wordml/cid" xmlns:w16="http://schemas.microsoft.com/office/word/2018/wordml" xmlns:w16du="http://schemas.microsoft.com/office/word/2023/wordml/word16du" xmlns:w16sdtdh="http://schemas.microsoft.com/office/word/2020/wordml/sdtdatahash" xmlns:w16sdtfl="http://schemas.microsoft.com/office/word/2024/wordml/sdtformatlock" xmlns:w16se="http://schemas.microsoft.com/office/word/2015/wordml/symex" mc:Ignorable="w14 w15 w16se w16cid w16 w16cex w16sdtdh w16sdtfl w16du">
+<w:styles xmlns:mc="http://schemas.openxmlformats.org/markup-compatibility/2006" xmlns:r="http://schemas.openxmlformats.org/officeDocument/2006/relationships" xmlns:w="http://schemas.openxmlformats.org/wordprocessingml/2006/main" xmlns:w14="http://schemas.microsoft.com/office/word/2010/wordml" xmlns:w15="http://schemas.microsoft.com/office/word/2012/wordml" xmlns:w16cex="http://schemas.microsoft.com/office/word/2018/wordml/cex" xmlns:w16cid="http://schemas.microsoft.com/office/word/2016/wordml/cid" xmlns:w16="http://schemas.microsoft.com/office/word/2018/wordml" xmlns:w16sdtdh="http://schemas.microsoft.com/office/word/2020/wordml/sdtdatahash" xmlns:w16se="http://schemas.microsoft.com/office/word/2015/wordml/symex" mc:Ignorable="w14 w15 w16se w16cid w16 w16cex w16sdtdh">
   <w:docDefaults>
     <w:rPrDefault>
       <w:rPr>

</xml_diff>